<commit_message>
docs: update SDLC documentation, AI proofs, diagrams and system configuration
</commit_message>
<xml_diff>
--- a/CacGiaiDoanThucHien/02_GenAI_SoftwareDevelopment_requirements-qa.docx
+++ b/CacGiaiDoanThucHien/02_GenAI_SoftwareDevelopment_requirements-qa.docx
@@ -3041,16 +3041,8 @@
             </w:tcMar>
           </w:tcPr>
           <w:p>
-            <w:pPr>
-              <w:spacing w:before="40" w:after="40" w:line="276" w:lineRule="auto"/>
-              <w:jc w:val="left"/>
-            </w:pPr>
             <w:r>
-              <w:rPr>
-                <w:rFonts w:ascii="Times New Roman" w:hAnsi="Times New Roman"/>
-                <w:sz w:val="22"/>
-              </w:rPr>
-              <w:t>Trợ lý AI &amp; Báo cáo Thống kê</w:t>
+              <w:t>Báo cáo Thống kê</w:t>
             </w:r>
           </w:p>
         </w:tc>

</xml_diff>